<commit_message>
Update student details for Chetan Pawar (PRN: 2125UCSM1037)
</commit_message>
<xml_diff>
--- a/Unit_1_LAN_Mini_Project_Report.docx
+++ b/Unit_1_LAN_Mini_Project_Report.docx
@@ -50,7 +50,16 @@
           <w:sz w:val="32"/>
           <w:szCs w:val="32"/>
         </w:rPr>
-        <w:t>PRN:2125UCSM1042</w:t>
+        <w:t>PRN:</w:t>
+      </w:r>
+      <w:r>
+        <w:rPr>
+          <w:rFonts w:ascii="Times New Roman" w:hAnsi="Times New Roman" w:cs="Times New Roman"/>
+          <w:b/>
+          <w:sz w:val="32"/>
+          <w:szCs w:val="32"/>
+        </w:rPr>
+        <w:t>2125UCSM1037</w:t>
       </w:r>
       <w:r>
         <w:rPr>
@@ -113,8 +122,8 @@
       </w:tblGrid>
       <w:tr>
         <w:trPr>
+          <w:cantSplit/>
           <w:jc w:val="center"/>
-          <w:cantSplit/>
         </w:trPr>
         <w:tc>
           <w:tcPr>
@@ -160,15 +169,15 @@
                 <w:sz w:val="32"/>
                 <w:szCs w:val="32"/>
               </w:rPr>
-              <w:t>Shubham</w:t>
+              <w:t>Chetan Pawar</w:t>
             </w:r>
           </w:p>
         </w:tc>
       </w:tr>
       <w:tr>
         <w:trPr>
+          <w:cantSplit/>
           <w:jc w:val="center"/>
-          <w:cantSplit/>
         </w:trPr>
         <w:tc>
           <w:tcPr>
@@ -221,8 +230,8 @@
       </w:tr>
       <w:tr>
         <w:trPr>
+          <w:cantSplit/>
           <w:jc w:val="center"/>
-          <w:cantSplit/>
         </w:trPr>
         <w:tc>
           <w:tcPr>
@@ -275,8 +284,8 @@
       </w:tr>
       <w:tr>
         <w:trPr>
+          <w:cantSplit/>
           <w:jc w:val="center"/>
-          <w:cantSplit/>
         </w:trPr>
         <w:tc>
           <w:tcPr>
@@ -329,8 +338,8 @@
       </w:tr>
       <w:tr>
         <w:trPr>
+          <w:cantSplit/>
           <w:jc w:val="center"/>
-          <w:cantSplit/>
         </w:trPr>
         <w:tc>
           <w:tcPr>
@@ -384,17 +393,16 @@
       <w:tr>
         <w:trPr>
           <w:cantSplit/>
+          <w:jc w:val="center"/>
         </w:trPr>
         <w:tc>
           <w:tcPr>
-            <w:tcW w:type="dxa" w:w="5040"/>
+            <w:tcW w:w="5040" w:type="dxa"/>
           </w:tcPr>
           <w:p>
             <w:pPr>
               <w:spacing w:before="60" w:after="60" w:line="276" w:lineRule="auto"/>
-              <w:jc w:val="left"/>
             </w:pPr>
-            <w:r/>
             <w:r>
               <w:rPr>
                 <w:rFonts w:ascii="Times New Roman" w:hAnsi="Times New Roman"/>
@@ -407,21 +415,18 @@
         </w:tc>
         <w:tc>
           <w:tcPr>
-            <w:tcW w:type="dxa" w:w="5040"/>
+            <w:tcW w:w="5040" w:type="dxa"/>
           </w:tcPr>
           <w:p>
             <w:pPr>
               <w:spacing w:before="60" w:after="60" w:line="276" w:lineRule="auto"/>
-              <w:jc w:val="left"/>
             </w:pPr>
-            <w:r/>
             <w:r>
               <w:rPr>
                 <w:rFonts w:ascii="Times New Roman" w:hAnsi="Times New Roman"/>
-                <w:b w:val="0"/>
                 <w:sz w:val="20"/>
               </w:rPr>
-              <w:t>Cisco-Packet-Tracer-LAN-Mini-Project</w:t>
+              <w:t>cisco</w:t>
             </w:r>
           </w:p>
         </w:tc>
@@ -429,17 +434,16 @@
       <w:tr>
         <w:trPr>
           <w:cantSplit/>
+          <w:jc w:val="center"/>
         </w:trPr>
         <w:tc>
           <w:tcPr>
-            <w:tcW w:type="dxa" w:w="5040"/>
+            <w:tcW w:w="5040" w:type="dxa"/>
           </w:tcPr>
           <w:p>
             <w:pPr>
               <w:spacing w:before="60" w:after="60" w:line="276" w:lineRule="auto"/>
-              <w:jc w:val="left"/>
             </w:pPr>
-            <w:r/>
             <w:r>
               <w:rPr>
                 <w:rFonts w:ascii="Times New Roman" w:hAnsi="Times New Roman"/>
@@ -452,22 +456,21 @@
         </w:tc>
         <w:tc>
           <w:tcPr>
-            <w:tcW w:type="dxa" w:w="5040"/>
+            <w:tcW w:w="5040" w:type="dxa"/>
           </w:tcPr>
           <w:p>
             <w:pPr>
               <w:spacing w:before="60" w:after="60"/>
             </w:pPr>
-            <w:r/>
-            <w:hyperlink r:id="rId13">
+            <w:hyperlink r:id="rId8">
               <w:r>
                 <w:rPr>
                   <w:rFonts w:ascii="Times New Roman" w:hAnsi="Times New Roman"/>
                   <w:color w:val="0000FF"/>
+                  <w:sz w:val="19"/>
                   <w:u w:val="single"/>
-                  <w:sz w:val="19"/>
                 </w:rPr>
-                <w:t>https://github.com/ShubhamShinde148/Cisco-Packet-Tracer-LAN-Mini-Project</w:t>
+                <w:t>https://github.com/ChetanPawar148/cisco.git</w:t>
               </w:r>
             </w:hyperlink>
           </w:p>
@@ -507,19 +510,8 @@
           <w:sz w:val="32"/>
           <w:szCs w:val="32"/>
         </w:rPr>
-        <w:t xml:space="preserve">Submitted as part of Unit 1 practical / </w:t>
+        <w:t>Submitted as part of Unit 1 practical / mini-project</w:t>
       </w:r>
-      <w:proofErr w:type="gramStart"/>
-      <w:r>
-        <w:rPr>
-          <w:rFonts w:ascii="Times New Roman" w:hAnsi="Times New Roman" w:cs="Times New Roman"/>
-          <w:i/>
-          <w:sz w:val="32"/>
-          <w:szCs w:val="32"/>
-        </w:rPr>
-        <w:t>mini-project</w:t>
-      </w:r>
-      <w:proofErr w:type="gramEnd"/>
     </w:p>
     <w:p>
       <w:pPr>
@@ -571,25 +563,7 @@
           <w:sz w:val="32"/>
           <w:szCs w:val="32"/>
         </w:rPr>
-        <w:t xml:space="preserve">To design and configure a Local Area Network (LAN) in Cisco Packet Tracer using one router, two switches, and four PCs. Static IPv4 addresses are assigned to all </w:t>
-      </w:r>
-      <w:proofErr w:type="gramStart"/>
-      <w:r>
-        <w:rPr>
-          <w:rFonts w:ascii="Times New Roman" w:hAnsi="Times New Roman" w:cs="Times New Roman"/>
-          <w:sz w:val="32"/>
-          <w:szCs w:val="32"/>
-        </w:rPr>
-        <w:t>PCs</w:t>
-      </w:r>
-      <w:proofErr w:type="gramEnd"/>
-      <w:r>
-        <w:rPr>
-          <w:rFonts w:ascii="Times New Roman" w:hAnsi="Times New Roman" w:cs="Times New Roman"/>
-          <w:sz w:val="32"/>
-          <w:szCs w:val="32"/>
-        </w:rPr>
-        <w:t xml:space="preserve"> and network connectivity is verified using the ping command, including communication between PCs connected to different switches.</w:t>
+        <w:t>To design and configure a Local Area Network (LAN) in Cisco Packet Tracer using one router, two switches, and four PCs. Static IPv4 addresses are assigned to all PCs and network connectivity is verified using the ping command, including communication between PCs connected to different switches.</w:t>
       </w:r>
     </w:p>
     <w:p>
@@ -624,8 +598,8 @@
       </w:tblGrid>
       <w:tr>
         <w:trPr>
+          <w:cantSplit/>
           <w:jc w:val="center"/>
-          <w:cantSplit/>
         </w:trPr>
         <w:tc>
           <w:tcPr>
@@ -705,8 +679,8 @@
       </w:tr>
       <w:tr>
         <w:trPr>
+          <w:cantSplit/>
           <w:jc w:val="center"/>
-          <w:cantSplit/>
         </w:trPr>
         <w:tc>
           <w:tcPr>
@@ -780,8 +754,8 @@
       </w:tr>
       <w:tr>
         <w:trPr>
+          <w:cantSplit/>
           <w:jc w:val="center"/>
-          <w:cantSplit/>
         </w:trPr>
         <w:tc>
           <w:tcPr>
@@ -855,8 +829,8 @@
       </w:tr>
       <w:tr>
         <w:trPr>
+          <w:cantSplit/>
           <w:jc w:val="center"/>
-          <w:cantSplit/>
         </w:trPr>
         <w:tc>
           <w:tcPr>
@@ -930,8 +904,8 @@
       </w:tr>
       <w:tr>
         <w:trPr>
+          <w:cantSplit/>
           <w:jc w:val="center"/>
-          <w:cantSplit/>
         </w:trPr>
         <w:tc>
           <w:tcPr>
@@ -1005,8 +979,8 @@
       </w:tr>
       <w:tr>
         <w:trPr>
+          <w:cantSplit/>
           <w:jc w:val="center"/>
-          <w:cantSplit/>
         </w:trPr>
         <w:tc>
           <w:tcPr>
@@ -1147,7 +1121,7 @@
                     <pic:cNvPicPr/>
                   </pic:nvPicPr>
                   <pic:blipFill>
-                    <a:blip r:embed="rId8"/>
+                    <a:blip r:embed="rId9"/>
                     <a:stretch>
                       <a:fillRect/>
                     </a:stretch>
@@ -1184,7 +1158,6 @@
           <w:sz w:val="32"/>
           <w:szCs w:val="32"/>
         </w:rPr>
-        <w:lastRenderedPageBreak/>
         <w:t>Figure 1: Cisco Packet Tracer LAN topology</w:t>
       </w:r>
     </w:p>
@@ -1203,6 +1176,7 @@
           <w:sz w:val="32"/>
           <w:szCs w:val="32"/>
         </w:rPr>
+        <w:lastRenderedPageBreak/>
         <w:t>4. IP Addressing Plan</w:t>
       </w:r>
     </w:p>
@@ -1222,8 +1196,8 @@
       </w:tblGrid>
       <w:tr>
         <w:trPr>
+          <w:cantSplit/>
           <w:jc w:val="center"/>
-          <w:cantSplit/>
         </w:trPr>
         <w:tc>
           <w:tcPr>
@@ -1353,8 +1327,8 @@
       </w:tr>
       <w:tr>
         <w:trPr>
+          <w:cantSplit/>
           <w:jc w:val="center"/>
-          <w:cantSplit/>
         </w:trPr>
         <w:tc>
           <w:tcPr>
@@ -1474,8 +1448,8 @@
       </w:tr>
       <w:tr>
         <w:trPr>
+          <w:cantSplit/>
           <w:jc w:val="center"/>
-          <w:cantSplit/>
         </w:trPr>
         <w:tc>
           <w:tcPr>
@@ -1595,8 +1569,8 @@
       </w:tr>
       <w:tr>
         <w:trPr>
+          <w:cantSplit/>
           <w:jc w:val="center"/>
-          <w:cantSplit/>
         </w:trPr>
         <w:tc>
           <w:tcPr>
@@ -1716,8 +1690,8 @@
       </w:tr>
       <w:tr>
         <w:trPr>
+          <w:cantSplit/>
           <w:jc w:val="center"/>
-          <w:cantSplit/>
         </w:trPr>
         <w:tc>
           <w:tcPr>
@@ -1837,8 +1811,8 @@
       </w:tr>
       <w:tr>
         <w:trPr>
+          <w:cantSplit/>
           <w:jc w:val="center"/>
-          <w:cantSplit/>
         </w:trPr>
         <w:tc>
           <w:tcPr>
@@ -2142,6 +2116,13 @@
           <w:szCs w:val="32"/>
         </w:rPr>
         <w:br/>
+      </w:r>
+      <w:r>
+        <w:rPr>
+          <w:rFonts w:ascii="Times New Roman" w:hAnsi="Times New Roman" w:cs="Times New Roman"/>
+          <w:sz w:val="32"/>
+          <w:szCs w:val="32"/>
+        </w:rPr>
         <w:t>ip address 192.168.10.1 255.255.255.0</w:t>
       </w:r>
       <w:r>
@@ -2196,7 +2177,6 @@
           <w:sz w:val="32"/>
           <w:szCs w:val="32"/>
         </w:rPr>
-        <w:lastRenderedPageBreak/>
         <w:t>7. Connectivity Verification</w:t>
       </w:r>
     </w:p>
@@ -2288,7 +2268,6 @@
           <w:sz w:val="32"/>
           <w:szCs w:val="32"/>
         </w:rPr>
-        <w:lastRenderedPageBreak/>
         <w:drawing>
           <wp:inline distT="0" distB="0" distL="0" distR="0" wp14:anchorId="372E407E" wp14:editId="046CEDAE">
             <wp:extent cx="3682940" cy="4114800"/>
@@ -2305,7 +2284,7 @@
                     <pic:cNvPicPr/>
                   </pic:nvPicPr>
                   <pic:blipFill>
-                    <a:blip r:embed="rId9"/>
+                    <a:blip r:embed="rId10"/>
                     <a:stretch>
                       <a:fillRect/>
                     </a:stretch>
@@ -2378,8 +2357,8 @@
       </w:tblGrid>
       <w:tr>
         <w:trPr>
+          <w:cantSplit/>
           <w:jc w:val="center"/>
-          <w:cantSplit/>
         </w:trPr>
         <w:tc>
           <w:tcPr>
@@ -2484,8 +2463,8 @@
       </w:tr>
       <w:tr>
         <w:trPr>
+          <w:cantSplit/>
           <w:jc w:val="center"/>
-          <w:cantSplit/>
         </w:trPr>
         <w:tc>
           <w:tcPr>
@@ -2582,8 +2561,8 @@
       </w:tr>
       <w:tr>
         <w:trPr>
+          <w:cantSplit/>
           <w:jc w:val="center"/>
-          <w:cantSplit/>
         </w:trPr>
         <w:tc>
           <w:tcPr>
@@ -2627,16 +2606,7 @@
                 <w:sz w:val="32"/>
                 <w:szCs w:val="32"/>
               </w:rPr>
-              <w:t xml:space="preserve">PC4 </w:t>
-            </w:r>
-            <w:r>
-              <w:rPr>
-                <w:rFonts w:ascii="Times New Roman" w:hAnsi="Times New Roman" w:cs="Times New Roman"/>
-                <w:sz w:val="32"/>
-                <w:szCs w:val="32"/>
-              </w:rPr>
-              <w:lastRenderedPageBreak/>
-              <w:t>(192.168.10.14)</w:t>
+              <w:t>PC4 (192.168.10.14)</w:t>
             </w:r>
           </w:p>
         </w:tc>
@@ -2659,17 +2629,7 @@
                 <w:sz w:val="32"/>
                 <w:szCs w:val="32"/>
               </w:rPr>
-              <w:lastRenderedPageBreak/>
-              <w:t xml:space="preserve">4 sent / 4 </w:t>
-            </w:r>
-            <w:r>
-              <w:rPr>
-                <w:rFonts w:ascii="Times New Roman" w:hAnsi="Times New Roman" w:cs="Times New Roman"/>
-                <w:sz w:val="32"/>
-                <w:szCs w:val="32"/>
-              </w:rPr>
-              <w:lastRenderedPageBreak/>
-              <w:t>received</w:t>
+              <w:t>4 sent / 4 received</w:t>
             </w:r>
           </w:p>
         </w:tc>
@@ -2692,17 +2652,7 @@
                 <w:sz w:val="32"/>
                 <w:szCs w:val="32"/>
               </w:rPr>
-              <w:lastRenderedPageBreak/>
-              <w:t xml:space="preserve">0% loss – </w:t>
-            </w:r>
-            <w:r>
-              <w:rPr>
-                <w:rFonts w:ascii="Times New Roman" w:hAnsi="Times New Roman" w:cs="Times New Roman"/>
-                <w:sz w:val="32"/>
-                <w:szCs w:val="32"/>
-              </w:rPr>
-              <w:lastRenderedPageBreak/>
-              <w:t>SUCCESS</w:t>
+              <w:t>0% loss – SUCCESS</w:t>
             </w:r>
           </w:p>
         </w:tc>
@@ -2723,7 +2673,6 @@
           <w:sz w:val="32"/>
           <w:szCs w:val="32"/>
         </w:rPr>
-        <w:lastRenderedPageBreak/>
         <w:t>9. Result</w:t>
       </w:r>
     </w:p>
@@ -2776,18 +2725,8 @@
           <w:sz w:val="32"/>
           <w:szCs w:val="32"/>
         </w:rPr>
-        <w:t xml:space="preserve">This </w:t>
+        <w:t>This mini-project</w:t>
       </w:r>
-      <w:proofErr w:type="gramStart"/>
-      <w:r>
-        <w:rPr>
-          <w:rFonts w:ascii="Times New Roman" w:hAnsi="Times New Roman" w:cs="Times New Roman"/>
-          <w:sz w:val="32"/>
-          <w:szCs w:val="32"/>
-        </w:rPr>
-        <w:t>mini-project</w:t>
-      </w:r>
-      <w:proofErr w:type="gramEnd"/>
       <w:r>
         <w:rPr>
           <w:rFonts w:ascii="Times New Roman" w:hAnsi="Times New Roman" w:cs="Times New Roman"/>
@@ -2916,20 +2855,20 @@
         </w:rPr>
         <w:t xml:space="preserve"> GitHub Repository: </w:t>
       </w:r>
-      <w:hyperlink r:id="rId13">
+      <w:hyperlink r:id="rId11">
         <w:r>
           <w:rPr>
             <w:rFonts w:ascii="Times New Roman" w:hAnsi="Times New Roman"/>
             <w:color w:val="0000FF"/>
+            <w:sz w:val="28"/>
             <w:u w:val="single"/>
-            <w:sz w:val="28"/>
           </w:rPr>
-          <w:t>https://github.com/ShubhamShinde148/Cisco-Packet-Tracer-LAN-Mini-Project</w:t>
+          <w:t>https://github.com/ChetanPawar148/cisco.git</w:t>
         </w:r>
       </w:hyperlink>
     </w:p>
     <w:sectPr>
-      <w:footerReference w:type="default" r:id="rId10"/>
+      <w:footerReference w:type="default" r:id="rId12"/>
       <w:pgSz w:w="12240" w:h="15840"/>
       <w:pgMar w:top="936" w:right="1080" w:bottom="936" w:left="1080" w:header="720" w:footer="720" w:gutter="0"/>
       <w:cols w:space="720"/>

</xml_diff>

<commit_message>
Update student details for Yash Kawade (PRN: 2125UCSM1118)
</commit_message>
<xml_diff>
--- a/Unit_1_LAN_Mini_Project_Report.docx
+++ b/Unit_1_LAN_Mini_Project_Report.docx
@@ -1,5 +1,70 @@
 
-<file path=word/document.xml><?xml version="1.0" encoding="utf-8"?>
+<file path=customXml\item1.xml><?xml version="1.0" encoding="utf-8"?>
+<b:Sources xmlns:b="http://schemas.openxmlformats.org/officeDocument/2006/bibliography" xmlns="http://schemas.openxmlformats.org/officeDocument/2006/bibliography" SelectedStyle="/APA.XSL" StyleName="APA"/>
+</file>
+
+<file path=customXml\itemProps1.xml><?xml version="1.0" encoding="utf-8"?>
+<ds:datastoreItem xmlns:ds="http://schemas.openxmlformats.org/officeDocument/2006/customXml" ds:itemID="{EF278816-EC6F-A645-907D-7F25AECB1D4A}">
+  <ds:schemaRefs>
+    <ds:schemaRef ds:uri="http://schemas.openxmlformats.org/officeDocument/2006/bibliography"/>
+  </ds:schemaRefs>
+</ds:datastoreItem>
+</file>
+
+<file path=docProps\app.xml><?xml version="1.0" encoding="utf-8"?>
+<Properties xmlns="http://schemas.openxmlformats.org/officeDocument/2006/extended-properties" xmlns:vt="http://schemas.openxmlformats.org/officeDocument/2006/docPropsVTypes">
+  <Template>Normal</Template>
+  <TotalTime>2</TotalTime>
+  <Pages>3</Pages>
+  <Words>583</Words>
+  <Characters>3328</Characters>
+  <Application>Microsoft Office Word</Application>
+  <DocSecurity>0</DocSecurity>
+  <Lines>27</Lines>
+  <Paragraphs>7</Paragraphs>
+  <ScaleCrop>false</ScaleCrop>
+  <HeadingPairs>
+    <vt:vector size="2" baseType="variant">
+      <vt:variant>
+        <vt:lpstr>Title</vt:lpstr>
+      </vt:variant>
+      <vt:variant>
+        <vt:i4>1</vt:i4>
+      </vt:variant>
+    </vt:vector>
+  </HeadingPairs>
+  <TitlesOfParts>
+    <vt:vector size="1" baseType="lpstr">
+      <vt:lpstr/>
+    </vt:vector>
+  </TitlesOfParts>
+  <Manager/>
+  <Company/>
+  <LinksUpToDate>false</LinksUpToDate>
+  <CharactersWithSpaces>3904</CharactersWithSpaces>
+  <SharedDoc>false</SharedDoc>
+  <HyperlinkBase/>
+  <HyperlinksChanged>false</HyperlinksChanged>
+  <AppVersion>16.0000</AppVersion>
+</Properties>
+</file>
+
+<file path=docProps\core.xml><?xml version="1.0" encoding="utf-8"?>
+<cp:coreProperties xmlns:cp="http://schemas.openxmlformats.org/package/2006/metadata/core-properties" xmlns:dc="http://purl.org/dc/elements/1.1/" xmlns:dcterms="http://purl.org/dc/terms/" xmlns:dcmitype="http://purl.org/dc/dcmitype/" xmlns:xsi="http://www.w3.org/2001/XMLSchema-instance">
+  <dc:title/>
+  <dc:subject/>
+  <dc:creator>Yash Kawade</dc:creator>
+  <cp:keywords/>
+  <dc:description>generated by Yash Kawade</dc:description>
+  <cp:lastModifiedBy>Yash Kawade</cp:lastModifiedBy>
+  <cp:revision>3</cp:revision>
+  <dcterms:created xsi:type="dcterms:W3CDTF">2013-12-23T23:15:00Z</dcterms:created>
+  <dcterms:modified xsi:type="dcterms:W3CDTF">2026-09-17T09:14:00Z</dcterms:modified>
+  <cp:category/>
+</cp:coreProperties>
+</file>
+
+<file path=word\document.xml><?xml version="1.0" encoding="utf-8"?>
 <w:document xmlns:wpc="http://schemas.microsoft.com/office/word/2010/wordprocessingCanvas" xmlns:cx="http://schemas.microsoft.com/office/drawing/2014/chartex" xmlns:cx1="http://schemas.microsoft.com/office/drawing/2015/9/8/chartex" xmlns:cx2="http://schemas.microsoft.com/office/drawing/2015/10/21/chartex" xmlns:cx3="http://schemas.microsoft.com/office/drawing/2016/5/9/chartex" xmlns:cx4="http://schemas.microsoft.com/office/drawing/2016/5/10/chartex" xmlns:cx5="http://schemas.microsoft.com/office/drawing/2016/5/11/chartex" xmlns:cx6="http://schemas.microsoft.com/office/drawing/2016/5/12/chartex" xmlns:cx7="http://schemas.microsoft.com/office/drawing/2016/5/13/chartex" xmlns:cx8="http://schemas.microsoft.com/office/drawing/2016/5/14/chartex" xmlns:mc="http://schemas.openxmlformats.org/markup-compatibility/2006" xmlns:aink="http://schemas.microsoft.com/office/drawing/2016/ink" xmlns:am3d="http://schemas.microsoft.com/office/drawing/2017/model3d" xmlns:o="urn:schemas-microsoft-com:office:office" xmlns:oel="http://schemas.microsoft.com/office/2019/extlst" xmlns:r="http://schemas.openxmlformats.org/officeDocument/2006/relationships" xmlns:m="http://schemas.openxmlformats.org/officeDocument/2006/math" xmlns:v="urn:schemas-microsoft-com:vml" xmlns:wp14="http://schemas.microsoft.com/office/word/2010/wordprocessingDrawing" xmlns:wp="http://schemas.openxmlformats.org/drawingml/2006/wordprocessingDrawing" xmlns:w10="urn:schemas-microsoft-com:office:word" xmlns:w="http://schemas.openxmlformats.org/wordprocessingml/2006/main" xmlns:w14="http://schemas.microsoft.com/office/word/2010/wordml" xmlns:w15="http://schemas.microsoft.com/office/word/2012/wordml" xmlns:w16cex="http://schemas.microsoft.com/office/word/2018/wordml/cex" xmlns:w16cid="http://schemas.microsoft.com/office/word/2016/wordml/cid" xmlns:w16="http://schemas.microsoft.com/office/word/2018/wordml" xmlns:w16du="http://schemas.microsoft.com/office/word/2023/wordml/word16du" xmlns:w16sdtdh="http://schemas.microsoft.com/office/word/2020/wordml/sdtdatahash" xmlns:w16sdtfl="http://schemas.microsoft.com/office/word/2024/wordml/sdtformatlock" xmlns:w16se="http://schemas.microsoft.com/office/word/2015/wordml/symex" xmlns:wpg="http://schemas.microsoft.com/office/word/2010/wordprocessingGroup" xmlns:wpi="http://schemas.microsoft.com/office/word/2010/wordprocessingInk" xmlns:wne="http://schemas.microsoft.com/office/word/2006/wordml" xmlns:wps="http://schemas.microsoft.com/office/word/2010/wordprocessingShape" mc:Ignorable="w14 w15 w16se w16cid w16 w16cex w16sdtdh w16sdtfl w16du wp14">
   <w:body>
     <w:p>
@@ -59,7 +124,7 @@
           <w:sz w:val="32"/>
           <w:szCs w:val="32"/>
         </w:rPr>
-        <w:t>2125UCSM1037</w:t>
+        <w:t>2125UCSM1118</w:t>
       </w:r>
       <w:r>
         <w:rPr>
@@ -169,7 +234,7 @@
                 <w:sz w:val="32"/>
                 <w:szCs w:val="32"/>
               </w:rPr>
-              <w:t>Chetan Pawar</w:t>
+              <w:t>Yash Kawade</w:t>
             </w:r>
           </w:p>
         </w:tc>
@@ -470,7 +535,7 @@
                   <w:sz w:val="19"/>
                   <w:u w:val="single"/>
                 </w:rPr>
-                <w:t>https://github.com/ChetanPawar148/cisco.git</w:t>
+                <w:t>https://github.com/kawdeyash/cisco.git</w:t>
               </w:r>
             </w:hyperlink>
           </w:p>
@@ -2863,7 +2928,7 @@
             <w:sz w:val="28"/>
             <w:u w:val="single"/>
           </w:rPr>
-          <w:t>https://github.com/ChetanPawar148/cisco.git</w:t>
+          <w:t>https://github.com/kawdeyash/cisco.git</w:t>
         </w:r>
       </w:hyperlink>
     </w:p>
@@ -2878,7 +2943,7 @@
 </w:document>
 </file>
 
-<file path=word/endnotes.xml><?xml version="1.0" encoding="utf-8"?>
+<file path=word\endnotes.xml><?xml version="1.0" encoding="utf-8"?>
 <w:endnotes xmlns:wpc="http://schemas.microsoft.com/office/word/2010/wordprocessingCanvas" xmlns:cx="http://schemas.microsoft.com/office/drawing/2014/chartex" xmlns:cx1="http://schemas.microsoft.com/office/drawing/2015/9/8/chartex" xmlns:cx2="http://schemas.microsoft.com/office/drawing/2015/10/21/chartex" xmlns:cx3="http://schemas.microsoft.com/office/drawing/2016/5/9/chartex" xmlns:cx4="http://schemas.microsoft.com/office/drawing/2016/5/10/chartex" xmlns:cx5="http://schemas.microsoft.com/office/drawing/2016/5/11/chartex" xmlns:cx6="http://schemas.microsoft.com/office/drawing/2016/5/12/chartex" xmlns:cx7="http://schemas.microsoft.com/office/drawing/2016/5/13/chartex" xmlns:cx8="http://schemas.microsoft.com/office/drawing/2016/5/14/chartex" xmlns:mc="http://schemas.openxmlformats.org/markup-compatibility/2006" xmlns:aink="http://schemas.microsoft.com/office/drawing/2016/ink" xmlns:am3d="http://schemas.microsoft.com/office/drawing/2017/model3d" xmlns:o="urn:schemas-microsoft-com:office:office" xmlns:oel="http://schemas.microsoft.com/office/2019/extlst" xmlns:r="http://schemas.openxmlformats.org/officeDocument/2006/relationships" xmlns:m="http://schemas.openxmlformats.org/officeDocument/2006/math" xmlns:v="urn:schemas-microsoft-com:vml" xmlns:wp14="http://schemas.microsoft.com/office/word/2010/wordprocessingDrawing" xmlns:wp="http://schemas.openxmlformats.org/drawingml/2006/wordprocessingDrawing" xmlns:w10="urn:schemas-microsoft-com:office:word" xmlns:w="http://schemas.openxmlformats.org/wordprocessingml/2006/main" xmlns:w14="http://schemas.microsoft.com/office/word/2010/wordml" xmlns:w15="http://schemas.microsoft.com/office/word/2012/wordml" xmlns:w16cex="http://schemas.microsoft.com/office/word/2018/wordml/cex" xmlns:w16cid="http://schemas.microsoft.com/office/word/2016/wordml/cid" xmlns:w16="http://schemas.microsoft.com/office/word/2018/wordml" xmlns:w16du="http://schemas.microsoft.com/office/word/2023/wordml/word16du" xmlns:w16sdtdh="http://schemas.microsoft.com/office/word/2020/wordml/sdtdatahash" xmlns:w16sdtfl="http://schemas.microsoft.com/office/word/2024/wordml/sdtformatlock" xmlns:w16se="http://schemas.microsoft.com/office/word/2015/wordml/symex" xmlns:wpg="http://schemas.microsoft.com/office/word/2010/wordprocessingGroup" xmlns:wpi="http://schemas.microsoft.com/office/word/2010/wordprocessingInk" xmlns:wne="http://schemas.microsoft.com/office/word/2006/wordml" xmlns:wps="http://schemas.microsoft.com/office/word/2010/wordprocessingShape" mc:Ignorable="w14 w15 w16se w16cid w16 w16cex w16sdtdh w16sdtfl w16du wp14">
   <w:endnote w:type="separator" w:id="-1">
     <w:p>
@@ -2903,7 +2968,76 @@
 </w:endnotes>
 </file>
 
-<file path=word/footer1.xml><?xml version="1.0" encoding="utf-8"?>
+<file path=word\fontTable.xml><?xml version="1.0" encoding="utf-8"?>
+<w:fonts xmlns:mc="http://schemas.openxmlformats.org/markup-compatibility/2006" xmlns:r="http://schemas.openxmlformats.org/officeDocument/2006/relationships" xmlns:w="http://schemas.openxmlformats.org/wordprocessingml/2006/main" xmlns:w14="http://schemas.microsoft.com/office/word/2010/wordml" xmlns:w15="http://schemas.microsoft.com/office/word/2012/wordml" xmlns:w16cex="http://schemas.microsoft.com/office/word/2018/wordml/cex" xmlns:w16cid="http://schemas.microsoft.com/office/word/2016/wordml/cid" xmlns:w16="http://schemas.microsoft.com/office/word/2018/wordml" xmlns:w16du="http://schemas.microsoft.com/office/word/2023/wordml/word16du" xmlns:w16sdtdh="http://schemas.microsoft.com/office/word/2020/wordml/sdtdatahash" xmlns:w16sdtfl="http://schemas.microsoft.com/office/word/2024/wordml/sdtformatlock" xmlns:w16se="http://schemas.microsoft.com/office/word/2015/wordml/symex" mc:Ignorable="w14 w15 w16se w16cid w16 w16cex w16sdtdh w16sdtfl w16du">
+  <w:font w:name="Symbol">
+    <w:panose1 w:val="05050102010706020507"/>
+    <w:charset w:val="02"/>
+    <w:family w:val="roman"/>
+    <w:pitch w:val="variable"/>
+    <w:sig w:usb0="00000000" w:usb1="10000000" w:usb2="00000000" w:usb3="00000000" w:csb0="80000000" w:csb1="00000000"/>
+  </w:font>
+  <w:font w:name="Times New Roman">
+    <w:panose1 w:val="02020603050405020304"/>
+    <w:charset w:val="00"/>
+    <w:family w:val="roman"/>
+    <w:pitch w:val="variable"/>
+    <w:sig w:usb0="E0002EFF" w:usb1="C000785B" w:usb2="00000009" w:usb3="00000000" w:csb0="000001FF" w:csb1="00000000"/>
+  </w:font>
+  <w:font w:name="Cambria">
+    <w:panose1 w:val="02040503050406030204"/>
+    <w:charset w:val="00"/>
+    <w:family w:val="roman"/>
+    <w:pitch w:val="variable"/>
+    <w:sig w:usb0="E00006FF" w:usb1="420024FF" w:usb2="02000000" w:usb3="00000000" w:csb0="0000019F" w:csb1="00000000"/>
+  </w:font>
+  <w:font w:name="MS Mincho">
+    <w:panose1 w:val="02020609040205080304"/>
+    <w:charset w:val="80"/>
+    <w:family w:val="modern"/>
+    <w:pitch w:val="fixed"/>
+    <w:sig w:usb0="E00002FF" w:usb1="6AC7FDFB" w:usb2="08000012" w:usb3="00000000" w:csb0="0002009F" w:csb1="00000000"/>
+  </w:font>
+  <w:font w:name="Mangal">
+    <w:panose1 w:val="00000400000000000000"/>
+    <w:charset w:val="00"/>
+    <w:family w:val="roman"/>
+    <w:pitch w:val="variable"/>
+    <w:sig w:usb0="00008003" w:usb1="00000000" w:usb2="00000000" w:usb3="00000000" w:csb0="00000001" w:csb1="00000000"/>
+  </w:font>
+  <w:font w:name="Calibri">
+    <w:panose1 w:val="020F0502020204030204"/>
+    <w:charset w:val="00"/>
+    <w:family w:val="swiss"/>
+    <w:pitch w:val="variable"/>
+    <w:sig w:usb0="E4002EFF" w:usb1="C200247B" w:usb2="00000009" w:usb3="00000000" w:csb0="000001FF" w:csb1="00000000"/>
+  </w:font>
+  <w:font w:name="MS Gothic">
+    <w:altName w:val="ＭＳ ゴシック"/>
+    <w:panose1 w:val="020B0609070205080204"/>
+    <w:charset w:val="80"/>
+    <w:family w:val="modern"/>
+    <w:pitch w:val="fixed"/>
+    <w:sig w:usb0="E00002FF" w:usb1="6AC7FDFB" w:usb2="08000012" w:usb3="00000000" w:csb0="0002009F" w:csb1="00000000"/>
+  </w:font>
+  <w:font w:name="Courier">
+    <w:panose1 w:val="02070409020205020404"/>
+    <w:charset w:val="00"/>
+    <w:family w:val="auto"/>
+    <w:pitch w:val="variable"/>
+    <w:sig w:usb0="00000003" w:usb1="00000000" w:usb2="00000000" w:usb3="00000000" w:csb0="00000001" w:csb1="00000000"/>
+  </w:font>
+  <w:font w:name="Segoe UI Symbol">
+    <w:panose1 w:val="020B0502040204020203"/>
+    <w:charset w:val="00"/>
+    <w:family w:val="swiss"/>
+    <w:pitch w:val="variable"/>
+    <w:sig w:usb0="800001E3" w:usb1="1200FFEF" w:usb2="00040000" w:usb3="00000000" w:csb0="00000001" w:csb1="00000000"/>
+  </w:font>
+</w:fonts>
+</file>
+
+<file path=word\footer1.xml><?xml version="1.0" encoding="utf-8"?>
 <w:ftr xmlns:wpc="http://schemas.microsoft.com/office/word/2010/wordprocessingCanvas" xmlns:cx="http://schemas.microsoft.com/office/drawing/2014/chartex" xmlns:cx1="http://schemas.microsoft.com/office/drawing/2015/9/8/chartex" xmlns:cx2="http://schemas.microsoft.com/office/drawing/2015/10/21/chartex" xmlns:cx3="http://schemas.microsoft.com/office/drawing/2016/5/9/chartex" xmlns:cx4="http://schemas.microsoft.com/office/drawing/2016/5/10/chartex" xmlns:cx5="http://schemas.microsoft.com/office/drawing/2016/5/11/chartex" xmlns:cx6="http://schemas.microsoft.com/office/drawing/2016/5/12/chartex" xmlns:cx7="http://schemas.microsoft.com/office/drawing/2016/5/13/chartex" xmlns:cx8="http://schemas.microsoft.com/office/drawing/2016/5/14/chartex" xmlns:mc="http://schemas.openxmlformats.org/markup-compatibility/2006" xmlns:aink="http://schemas.microsoft.com/office/drawing/2016/ink" xmlns:am3d="http://schemas.microsoft.com/office/drawing/2017/model3d" xmlns:o="urn:schemas-microsoft-com:office:office" xmlns:oel="http://schemas.microsoft.com/office/2019/extlst" xmlns:r="http://schemas.openxmlformats.org/officeDocument/2006/relationships" xmlns:m="http://schemas.openxmlformats.org/officeDocument/2006/math" xmlns:v="urn:schemas-microsoft-com:vml" xmlns:wp14="http://schemas.microsoft.com/office/word/2010/wordprocessingDrawing" xmlns:wp="http://schemas.openxmlformats.org/drawingml/2006/wordprocessingDrawing" xmlns:w10="urn:schemas-microsoft-com:office:word" xmlns:w="http://schemas.openxmlformats.org/wordprocessingml/2006/main" xmlns:w14="http://schemas.microsoft.com/office/word/2010/wordml" xmlns:w15="http://schemas.microsoft.com/office/word/2012/wordml" xmlns:w16cex="http://schemas.microsoft.com/office/word/2018/wordml/cex" xmlns:w16cid="http://schemas.microsoft.com/office/word/2016/wordml/cid" xmlns:w16="http://schemas.microsoft.com/office/word/2018/wordml" xmlns:w16du="http://schemas.microsoft.com/office/word/2023/wordml/word16du" xmlns:w16sdtdh="http://schemas.microsoft.com/office/word/2020/wordml/sdtdatahash" xmlns:w16sdtfl="http://schemas.microsoft.com/office/word/2024/wordml/sdtformatlock" xmlns:w16se="http://schemas.microsoft.com/office/word/2015/wordml/symex" xmlns:wpg="http://schemas.microsoft.com/office/word/2010/wordprocessingGroup" xmlns:wpi="http://schemas.microsoft.com/office/word/2010/wordprocessingInk" xmlns:wne="http://schemas.microsoft.com/office/word/2006/wordml" xmlns:wps="http://schemas.microsoft.com/office/word/2010/wordprocessingShape" mc:Ignorable="w14 w15 w16se w16cid w16 w16cex w16sdtdh w16sdtfl w16du wp14">
   <w:p>
     <w:pPr>
@@ -2935,7 +3069,7 @@
 </w:ftr>
 </file>
 
-<file path=word/footnotes.xml><?xml version="1.0" encoding="utf-8"?>
+<file path=word\footnotes.xml><?xml version="1.0" encoding="utf-8"?>
 <w:footnotes xmlns:wpc="http://schemas.microsoft.com/office/word/2010/wordprocessingCanvas" xmlns:cx="http://schemas.microsoft.com/office/drawing/2014/chartex" xmlns:cx1="http://schemas.microsoft.com/office/drawing/2015/9/8/chartex" xmlns:cx2="http://schemas.microsoft.com/office/drawing/2015/10/21/chartex" xmlns:cx3="http://schemas.microsoft.com/office/drawing/2016/5/9/chartex" xmlns:cx4="http://schemas.microsoft.com/office/drawing/2016/5/10/chartex" xmlns:cx5="http://schemas.microsoft.com/office/drawing/2016/5/11/chartex" xmlns:cx6="http://schemas.microsoft.com/office/drawing/2016/5/12/chartex" xmlns:cx7="http://schemas.microsoft.com/office/drawing/2016/5/13/chartex" xmlns:cx8="http://schemas.microsoft.com/office/drawing/2016/5/14/chartex" xmlns:mc="http://schemas.openxmlformats.org/markup-compatibility/2006" xmlns:aink="http://schemas.microsoft.com/office/drawing/2016/ink" xmlns:am3d="http://schemas.microsoft.com/office/drawing/2017/model3d" xmlns:o="urn:schemas-microsoft-com:office:office" xmlns:oel="http://schemas.microsoft.com/office/2019/extlst" xmlns:r="http://schemas.openxmlformats.org/officeDocument/2006/relationships" xmlns:m="http://schemas.openxmlformats.org/officeDocument/2006/math" xmlns:v="urn:schemas-microsoft-com:vml" xmlns:wp14="http://schemas.microsoft.com/office/word/2010/wordprocessingDrawing" xmlns:wp="http://schemas.openxmlformats.org/drawingml/2006/wordprocessingDrawing" xmlns:w10="urn:schemas-microsoft-com:office:word" xmlns:w="http://schemas.openxmlformats.org/wordprocessingml/2006/main" xmlns:w14="http://schemas.microsoft.com/office/word/2010/wordml" xmlns:w15="http://schemas.microsoft.com/office/word/2012/wordml" xmlns:w16cex="http://schemas.microsoft.com/office/word/2018/wordml/cex" xmlns:w16cid="http://schemas.microsoft.com/office/word/2016/wordml/cid" xmlns:w16="http://schemas.microsoft.com/office/word/2018/wordml" xmlns:w16du="http://schemas.microsoft.com/office/word/2023/wordml/word16du" xmlns:w16sdtdh="http://schemas.microsoft.com/office/word/2020/wordml/sdtdatahash" xmlns:w16sdtfl="http://schemas.microsoft.com/office/word/2024/wordml/sdtformatlock" xmlns:w16se="http://schemas.microsoft.com/office/word/2015/wordml/symex" xmlns:wpg="http://schemas.microsoft.com/office/word/2010/wordprocessingGroup" xmlns:wpi="http://schemas.microsoft.com/office/word/2010/wordprocessingInk" xmlns:wne="http://schemas.microsoft.com/office/word/2006/wordml" xmlns:wps="http://schemas.microsoft.com/office/word/2010/wordprocessingShape" mc:Ignorable="w14 w15 w16se w16cid w16 w16cex w16sdtdh w16sdtfl w16du wp14">
   <w:footnote w:type="separator" w:id="-1">
     <w:p>
@@ -2960,7 +3094,7 @@
 </w:footnotes>
 </file>
 
-<file path=word/numbering.xml><?xml version="1.0" encoding="utf-8"?>
+<file path=word\numbering.xml><?xml version="1.0" encoding="utf-8"?>
 <w:numbering xmlns:wpc="http://schemas.microsoft.com/office/word/2010/wordprocessingCanvas" xmlns:cx="http://schemas.microsoft.com/office/drawing/2014/chartex" xmlns:cx1="http://schemas.microsoft.com/office/drawing/2015/9/8/chartex" xmlns:cx2="http://schemas.microsoft.com/office/drawing/2015/10/21/chartex" xmlns:cx3="http://schemas.microsoft.com/office/drawing/2016/5/9/chartex" xmlns:cx4="http://schemas.microsoft.com/office/drawing/2016/5/10/chartex" xmlns:cx5="http://schemas.microsoft.com/office/drawing/2016/5/11/chartex" xmlns:cx6="http://schemas.microsoft.com/office/drawing/2016/5/12/chartex" xmlns:cx7="http://schemas.microsoft.com/office/drawing/2016/5/13/chartex" xmlns:cx8="http://schemas.microsoft.com/office/drawing/2016/5/14/chartex" xmlns:mc="http://schemas.openxmlformats.org/markup-compatibility/2006" xmlns:aink="http://schemas.microsoft.com/office/drawing/2016/ink" xmlns:am3d="http://schemas.microsoft.com/office/drawing/2017/model3d" xmlns:o="urn:schemas-microsoft-com:office:office" xmlns:oel="http://schemas.microsoft.com/office/2019/extlst" xmlns:r="http://schemas.openxmlformats.org/officeDocument/2006/relationships" xmlns:m="http://schemas.openxmlformats.org/officeDocument/2006/math" xmlns:v="urn:schemas-microsoft-com:vml" xmlns:wp14="http://schemas.microsoft.com/office/word/2010/wordprocessingDrawing" xmlns:wp="http://schemas.openxmlformats.org/drawingml/2006/wordprocessingDrawing" xmlns:w10="urn:schemas-microsoft-com:office:word" xmlns:w="http://schemas.openxmlformats.org/wordprocessingml/2006/main" xmlns:w14="http://schemas.microsoft.com/office/word/2010/wordml" xmlns:w15="http://schemas.microsoft.com/office/word/2012/wordml" xmlns:w16cex="http://schemas.microsoft.com/office/word/2018/wordml/cex" xmlns:w16cid="http://schemas.microsoft.com/office/word/2016/wordml/cid" xmlns:w16="http://schemas.microsoft.com/office/word/2018/wordml" xmlns:w16du="http://schemas.microsoft.com/office/word/2023/wordml/word16du" xmlns:w16sdtdh="http://schemas.microsoft.com/office/word/2020/wordml/sdtdatahash" xmlns:w16sdtfl="http://schemas.microsoft.com/office/word/2024/wordml/sdtformatlock" xmlns:w16se="http://schemas.microsoft.com/office/word/2015/wordml/symex" xmlns:wpg="http://schemas.microsoft.com/office/word/2010/wordprocessingGroup" xmlns:wpi="http://schemas.microsoft.com/office/word/2010/wordprocessingInk" xmlns:wne="http://schemas.microsoft.com/office/word/2006/wordml" xmlns:wps="http://schemas.microsoft.com/office/word/2010/wordprocessingShape" mc:Ignorable="w14 w15 w16se w16cid w16 w16cex w16sdtdh w16sdtfl w16du wp14">
   <w:abstractNum w:abstractNumId="0" w15:restartNumberingAfterBreak="0">
     <w:nsid w:val="FFFFFF7C"/>
@@ -3163,7 +3297,79 @@
 </w:numbering>
 </file>
 
-<file path=word/styles.xml><?xml version="1.0" encoding="utf-8"?>
+<file path=word\settings.xml><?xml version="1.0" encoding="utf-8"?>
+<w:settings xmlns:mc="http://schemas.openxmlformats.org/markup-compatibility/2006" xmlns:o="urn:schemas-microsoft-com:office:office" xmlns:r="http://schemas.openxmlformats.org/officeDocument/2006/relationships" xmlns:m="http://schemas.openxmlformats.org/officeDocument/2006/math" xmlns:v="urn:schemas-microsoft-com:vml" xmlns:w10="urn:schemas-microsoft-com:office:word" xmlns:w="http://schemas.openxmlformats.org/wordprocessingml/2006/main" xmlns:w14="http://schemas.microsoft.com/office/word/2010/wordml" xmlns:w15="http://schemas.microsoft.com/office/word/2012/wordml" xmlns:w16cex="http://schemas.microsoft.com/office/word/2018/wordml/cex" xmlns:w16cid="http://schemas.microsoft.com/office/word/2016/wordml/cid" xmlns:w16="http://schemas.microsoft.com/office/word/2018/wordml" xmlns:w16du="http://schemas.microsoft.com/office/word/2023/wordml/word16du" xmlns:w16sdtdh="http://schemas.microsoft.com/office/word/2020/wordml/sdtdatahash" xmlns:w16sdtfl="http://schemas.microsoft.com/office/word/2024/wordml/sdtformatlock" xmlns:w16se="http://schemas.microsoft.com/office/word/2015/wordml/symex" xmlns:sl="http://schemas.openxmlformats.org/schemaLibrary/2006/main" mc:Ignorable="w14 w15 w16se w16cid w16 w16cex w16sdtdh w16sdtfl w16du">
+  <w:zoom w:percent="100"/>
+  <w:defaultTabStop w:val="720"/>
+  <w:characterSpacingControl w:val="doNotCompress"/>
+  <w:footnotePr>
+    <w:footnote w:id="-1"/>
+    <w:footnote w:id="0"/>
+  </w:footnotePr>
+  <w:endnotePr>
+    <w:endnote w:id="-1"/>
+    <w:endnote w:id="0"/>
+  </w:endnotePr>
+  <w:compat>
+    <w:useFELayout/>
+    <w:compatSetting w:name="compatibilityMode" w:uri="http://schemas.microsoft.com/office/word" w:val="14"/>
+    <w:compatSetting w:name="overrideTableStyleFontSizeAndJustification" w:uri="http://schemas.microsoft.com/office/word" w:val="1"/>
+    <w:compatSetting w:name="enableOpenTypeFeatures" w:uri="http://schemas.microsoft.com/office/word" w:val="1"/>
+    <w:compatSetting w:name="doNotFlipMirrorIndents" w:uri="http://schemas.microsoft.com/office/word" w:val="1"/>
+    <w:compatSetting w:name="useWord2013TrackBottomHyphenation" w:uri="http://schemas.microsoft.com/office/word" w:val="1"/>
+  </w:compat>
+  <w:rsids>
+    <w:rsidRoot w:val="00B47730"/>
+    <w:rsid w:val="00006577"/>
+    <w:rsid w:val="00034616"/>
+    <w:rsid w:val="0006063C"/>
+    <w:rsid w:val="0015074B"/>
+    <w:rsid w:val="001978D7"/>
+    <w:rsid w:val="0029639D"/>
+    <w:rsid w:val="00326F90"/>
+    <w:rsid w:val="00375B23"/>
+    <w:rsid w:val="00725121"/>
+    <w:rsid w:val="009E0397"/>
+    <w:rsid w:val="00AA1D8D"/>
+    <w:rsid w:val="00B47730"/>
+    <w:rsid w:val="00C27679"/>
+    <w:rsid w:val="00CB0664"/>
+    <w:rsid w:val="00D16B95"/>
+    <w:rsid w:val="00DD18E0"/>
+    <w:rsid w:val="00F5569D"/>
+    <w:rsid w:val="00FC693F"/>
+  </w:rsids>
+  <m:mathPr>
+    <m:mathFont m:val="Cambria Math"/>
+    <m:brkBin m:val="before"/>
+    <m:brkBinSub m:val="--"/>
+    <m:smallFrac m:val="0"/>
+    <m:dispDef/>
+    <m:lMargin m:val="0"/>
+    <m:rMargin m:val="0"/>
+    <m:defJc m:val="centerGroup"/>
+    <m:wrapIndent m:val="1440"/>
+    <m:intLim m:val="subSup"/>
+    <m:naryLim m:val="undOvr"/>
+  </m:mathPr>
+  <w:themeFontLang w:val="en-US" w:eastAsia="ja-JP" w:bidi="mr-IN"/>
+  <w:clrSchemeMapping w:bg1="light1" w:t1="dark1" w:bg2="light2" w:t2="dark2" w:accent1="accent1" w:accent2="accent2" w:accent3="accent3" w:accent4="accent4" w:accent5="accent5" w:accent6="accent6" w:hyperlink="hyperlink" w:followedHyperlink="followedHyperlink"/>
+  <w:doNotAutoCompressPictures/>
+  <w:shapeDefaults>
+    <o:shapedefaults v:ext="edit" spidmax="1026"/>
+    <o:shapelayout v:ext="edit">
+      <o:idmap v:ext="edit" data="1"/>
+    </o:shapelayout>
+  </w:shapeDefaults>
+  <w:decimalSymbol w:val="."/>
+  <w:listSeparator w:val=","/>
+  <w14:docId w14:val="033DEF36"/>
+  <w14:defaultImageDpi w14:val="300"/>
+  <w15:docId w15:val="{3A952735-391C-4D65-82A6-DCD83DDBD5D4}"/>
+</w:settings>
+</file>
+
+<file path=word\styles.xml><?xml version="1.0" encoding="utf-8"?>
 <w:styles xmlns:mc="http://schemas.openxmlformats.org/markup-compatibility/2006" xmlns:r="http://schemas.openxmlformats.org/officeDocument/2006/relationships" xmlns:w="http://schemas.openxmlformats.org/wordprocessingml/2006/main" xmlns:w14="http://schemas.microsoft.com/office/word/2010/wordml" xmlns:w15="http://schemas.microsoft.com/office/word/2012/wordml" xmlns:w16cex="http://schemas.microsoft.com/office/word/2018/wordml/cex" xmlns:w16cid="http://schemas.microsoft.com/office/word/2016/wordml/cid" xmlns:w16="http://schemas.microsoft.com/office/word/2018/wordml" xmlns:w16du="http://schemas.microsoft.com/office/word/2023/wordml/word16du" xmlns:w16sdtdh="http://schemas.microsoft.com/office/word/2020/wordml/sdtdatahash" xmlns:w16sdtfl="http://schemas.microsoft.com/office/word/2024/wordml/sdtformatlock" xmlns:w16se="http://schemas.microsoft.com/office/word/2015/wordml/symex" mc:Ignorable="w14 w15 w16se w16cid w16 w16cex w16sdtdh w16sdtfl w16du">
   <w:docDefaults>
     <w:rPrDefault>
@@ -14549,7 +14755,7 @@
 </w:styles>
 </file>
 
-<file path=word/theme/theme1.xml><?xml version="1.0" encoding="utf-8"?>
+<file path=word\theme\theme1.xml><?xml version="1.0" encoding="utf-8"?>
 <a:theme xmlns:a="http://schemas.openxmlformats.org/drawingml/2006/main" name="Office Theme">
   <a:themeElements>
     <a:clrScheme name="Office">
@@ -14869,14 +15075,8 @@
 </a:theme>
 </file>
 
-<file path=customXml/item1.xml><?xml version="1.0" encoding="utf-8"?>
-<b:Sources xmlns:b="http://schemas.openxmlformats.org/officeDocument/2006/bibliography" xmlns="http://schemas.openxmlformats.org/officeDocument/2006/bibliography" SelectedStyle="/APA.XSL" StyleName="APA"/>
-</file>
-
-<file path=customXml/itemProps1.xml><?xml version="1.0" encoding="utf-8"?>
-<ds:datastoreItem xmlns:ds="http://schemas.openxmlformats.org/officeDocument/2006/customXml" ds:itemID="{EF278816-EC6F-A645-907D-7F25AECB1D4A}">
-  <ds:schemaRefs>
-    <ds:schemaRef ds:uri="http://schemas.openxmlformats.org/officeDocument/2006/bibliography"/>
-  </ds:schemaRefs>
-</ds:datastoreItem>
+<file path=word\webSettings.xml><?xml version="1.0" encoding="utf-8"?>
+<w:webSettings xmlns:mc="http://schemas.openxmlformats.org/markup-compatibility/2006" xmlns:r="http://schemas.openxmlformats.org/officeDocument/2006/relationships" xmlns:w="http://schemas.openxmlformats.org/wordprocessingml/2006/main" xmlns:w14="http://schemas.microsoft.com/office/word/2010/wordml" xmlns:w15="http://schemas.microsoft.com/office/word/2012/wordml" xmlns:w16cex="http://schemas.microsoft.com/office/word/2018/wordml/cex" xmlns:w16cid="http://schemas.microsoft.com/office/word/2016/wordml/cid" xmlns:w16="http://schemas.microsoft.com/office/word/2018/wordml" xmlns:w16du="http://schemas.microsoft.com/office/word/2023/wordml/word16du" xmlns:w16sdtdh="http://schemas.microsoft.com/office/word/2020/wordml/sdtdatahash" xmlns:w16sdtfl="http://schemas.microsoft.com/office/word/2024/wordml/sdtformatlock" xmlns:w16se="http://schemas.microsoft.com/office/word/2015/wordml/symex" mc:Ignorable="w14 w15 w16se w16cid w16 w16cex w16sdtdh w16sdtfl w16du">
+  <w:allowPNG/>
+</w:webSettings>
 </file>
</xml_diff>